<commit_message>
Ajustar el MIA tras la revisión del equipo
- Explicar por qué el modelo da menos que DiD: DiD no descuenta el tiempo atmosférico
- Random Forest empata en la práctica con Gradient Boosting; se eligió por la regla fijada
- Fuentes de Project Green Light (Boston) y del protocolo de NO2 de Madrid, leídas y confirmadas
- Indicador de horas de trabajo manual: a medir en la puesta en marcha
</commit_message>
<xml_diff>
--- a/docs/MIA_Haizen_Lab.docx
+++ b/docs/MIA_Haizen_Lab.docx
@@ -1062,6 +1062,7 @@
                 <w:sz w:val="22"/>
                 <w:szCs w:val="22"/>
               </w:rPr>
+              <w:lastRenderedPageBreak/>
               <w:t>Interpretación</w:t>
             </w:r>
           </w:p>
@@ -1128,11 +1129,7 @@
         <w:t xml:space="preserve"> </w:t>
       </w:r>
       <w:r>
-        <w:t xml:space="preserve">en todo el periodo (completitud de al menos 93,13 %). Arraiz no entra: está en un monte, lejos del tráfico (8,73 µg/m³ antes de la ZBE). Son comparables porque tienen el mismo tiempo atmosférico y el mismo tipo de coches que el centro, pero no la ZBE. No tienen el mismo nivel de </w:t>
-      </w:r>
-      <w:r>
-        <w:lastRenderedPageBreak/>
-        <w:t>NO</w:t>
+        <w:t>en todo el periodo (completitud de al menos 93,13 %). Arraiz no entra: está en un monte, lejos del tráfico (8,73 µg/m³ antes de la ZBE). Son comparables porque tienen el mismo tiempo atmosférico y el mismo tipo de coches que el centro, pero no la ZBE. No tienen el mismo nivel de NO</w:t>
       </w:r>
       <w:r>
         <w:rPr>
@@ -2020,9 +2017,9 @@
         <w:tblLook w:val="04A0" w:firstRow="1" w:lastRow="0" w:firstColumn="1" w:lastColumn="0" w:noHBand="0" w:noVBand="1"/>
       </w:tblPr>
       <w:tblGrid>
-        <w:gridCol w:w="2094"/>
-        <w:gridCol w:w="4898"/>
-        <w:gridCol w:w="2631"/>
+        <w:gridCol w:w="2053"/>
+        <w:gridCol w:w="5019"/>
+        <w:gridCol w:w="2551"/>
       </w:tblGrid>
       <w:tr>
         <w:tc>
@@ -2709,7 +2706,7 @@
                 <w:sz w:val="22"/>
                 <w:szCs w:val="22"/>
               </w:rPr>
-              <w:t>Aprende de datos de tráfico y recomienda tiempos de semáforo para reducir paradas y emisiones en los cruces.</w:t>
+              <w:t>Modela el tráfico con IA y datos de Google Maps y recomienda tiempos de semáforo. Boston, ciudad participante, cita los primeros resultados del programa: hasta un 30 % menos de paradas y hasta un 10 % menos de emisiones en los cruces.</w:t>
             </w:r>
           </w:p>
         </w:tc>
@@ -2805,11 +2802,25 @@
         <w:t xml:space="preserve"> </w:t>
       </w:r>
       <w:r>
-        <w:t xml:space="preserve">si se supera, se informa a la población y, si un protocolo lo prevé, se aplican medidas. Madrid tiene un protocolo de este tipo con niveles de preaviso, aviso y alerta [6]. Solo el primer paso es IA; el segundo y el tercero son reglas. En Bilbao no hubo ninguna hora por encima de 200 µg/m³ entre 2022 y 2026 (máximo horario: 168 µg/m³), </w:t>
-      </w:r>
-      <w:r>
-        <w:lastRenderedPageBreak/>
-        <w:t>así que este aviso no se habría activado nunca. Tiene menos relación con la decisión sobre la ZBE que la evaluación del efecto, que es lo que se propone.</w:t>
+        <w:t>si se supera, se informa a la población y, si un protocolo lo prevé, se aplican medidas. El protocolo de Madrid para el NO</w:t>
+      </w:r>
+      <w:r>
+        <w:rPr>
+          <w:vertAlign w:val="subscript"/>
+        </w:rPr>
+        <w:t>2</w:t>
+      </w:r>
+      <w:r>
+        <w:t xml:space="preserve"> [6] sigue este esquema: fija niveles de preaviso, aviso y alerta (200, 250 y 400 µg/m³ superados en varias estaciones de una zona durante horas seguidas) y solo aplica sus escenarios de medidas cuando la previsión meteorológica de AEMET es desfavorable. Allí la previsión es meteorológica; un modelo de IA como el del caso [4] permitiría prever directamente el NO</w:t>
+      </w:r>
+      <w:r>
+        <w:rPr>
+          <w:vertAlign w:val="subscript"/>
+        </w:rPr>
+        <w:t>2</w:t>
+      </w:r>
+      <w:r>
+        <w:t>. Solo el primer paso puede ser IA; el segundo y el tercero son reglas. En Bilbao no hubo ninguna hora por encima de 200 µg/m³ entre {min(horas_200)} y {max(horas_200)} (máximo horario: 168 µg/m³), así que este aviso no se habría activado nunca. Tiene menos relación con la decisión sobre la ZBE que la evaluación del efecto, que es lo que se propone.</w:t>
       </w:r>
     </w:p>
     <w:p>
@@ -3644,7 +3655,10 @@
         <w:t>Diferencias en diferencias (DiD) no es IA.</w:t>
       </w:r>
       <w:r>
-        <w:t xml:space="preserve"> Es un método estadístico: la caída de dentro menos la caída de fuera. Se usa como comprobación del resultado del modelo (apartado 8).</w:t>
+        <w:t xml:space="preserve"> </w:t>
+      </w:r>
+      <w:r>
+        <w:t>Es un método estadístico: la caída de dentro menos la caída de fuera. Se usa como comprobación del resultado del modelo (apartado 8).</w:t>
       </w:r>
     </w:p>
     <w:p>
@@ -3676,10 +3690,7 @@
         <w:t>MAE:</w:t>
       </w:r>
       <w:r>
-        <w:t xml:space="preserve"> </w:t>
-      </w:r>
-      <w:r>
-        <w:t xml:space="preserve">cuántos µg/m³ se equivoca el modelo en una hora, de media. </w:t>
+        <w:t xml:space="preserve"> cuántos µg/m³ se equivoca el modelo en una hora, de media. </w:t>
       </w:r>
       <w:r>
         <w:rPr>
@@ -3689,7 +3700,10 @@
         <w:t>RMSE:</w:t>
       </w:r>
       <w:r>
-        <w:t xml:space="preserve"> parecido, pero castiga más los errores grandes. </w:t>
+        <w:t xml:space="preserve"> </w:t>
+      </w:r>
+      <w:r>
+        <w:t xml:space="preserve">parecido, pero castiga más los errores grandes. </w:t>
       </w:r>
       <w:r>
         <w:rPr>
@@ -4689,10 +4703,7 @@
         <w:t>2</w:t>
       </w:r>
       <w:r>
-        <w:t xml:space="preserve"> </w:t>
-      </w:r>
-      <w:r>
-        <w:t>medio de cada estación a esa hora en ese mes. Si un modelo de IA no lo mejora, no aporta nada.</w:t>
+        <w:t xml:space="preserve"> medio de cada estación a esa hora en ese mes. Si un modelo de IA no lo mejora, no aporta nada.</w:t>
       </w:r>
     </w:p>
     <w:p>
@@ -4710,7 +4721,10 @@
         <w:t>Regresión lineal:</w:t>
       </w:r>
       <w:r>
-        <w:t xml:space="preserve"> suma cada variable multiplicada por un peso; solo dibuja rectas.</w:t>
+        <w:t xml:space="preserve"> </w:t>
+      </w:r>
+      <w:r>
+        <w:t>suma cada variable multiplicada por un peso; solo dibuja rectas.</w:t>
       </w:r>
     </w:p>
     <w:p>
@@ -4809,11 +4823,7 @@
         <w:t xml:space="preserve"> </w:t>
       </w:r>
       <w:r>
-        <w:t xml:space="preserve">red neuronal para secuencias, con miles de parámetros. Con dos años de entrenamiento solo ve dos veces cada estación del año; Random Forest ya mejora la base un </w:t>
-      </w:r>
-      <w:r>
-        <w:lastRenderedPageBreak/>
-        <w:t>22,5 %. Es más difícil de explicar (no se puede ver qué hace con cada variable), necesita más cálculo y tendría el mismo problema que SARIMAX si usara el NO</w:t>
+        <w:t>red neuronal para secuencias, con miles de parámetros. Con dos años de entrenamiento solo ve dos veces cada estación del año; Random Forest ya mejora la base un 22,5 %. Es más difícil de explicar (no se puede ver qué hace con cada variable), necesita más cálculo y tendría el mismo problema que SARIMAX si usara el NO</w:t>
       </w:r>
       <w:r>
         <w:rPr>
@@ -4851,7 +4861,7 @@
         <w:t>Random Forest</w:t>
       </w:r>
       <w:r>
-        <w:t>, porque tiene el menor error en validación (8,14 µg/m³), un 22,5 % menos que la base. Gradient Boosting queda a 0,01 µg/m³: casi empatan, y se elige por el criterio fijado de antemano (menor MAE en validación). Cada árbol hace preguntas como «¿viento de menos de 2 m/s?», «¿entre las 7 y las 9?», «¿laborable?», y al final da el NO</w:t>
+        <w:t>, porque tiene el menor error en validación (8,14 µg/m³), un 22,5 % menos que la base. En la práctica empata con Gradient Boosting: la diferencia es de 0,01 µg/m³. Se eligió Random Forest por la regla fijada de antemano: el menor MAE en validación. Cada árbol hace preguntas como «¿viento de menos de 2 m/s?», «¿entre las 7 y las 9?», «¿laborable?», y al final da el NO</w:t>
       </w:r>
       <w:r>
         <w:rPr>
@@ -4875,7 +4885,10 @@
         <w:t>Por qué hace falta un modelo no lineal.</w:t>
       </w:r>
       <w:r>
-        <w:t xml:space="preserve"> Una relación es lineal si cada m/s de viento de más baja el NO</w:t>
+        <w:t xml:space="preserve"> </w:t>
+      </w:r>
+      <w:r>
+        <w:t>Una relación es lineal si cada m/s de viento de más baja el NO</w:t>
       </w:r>
       <w:r>
         <w:rPr>
@@ -4884,10 +4897,7 @@
         <w:t>2</w:t>
       </w:r>
       <w:r>
-        <w:t xml:space="preserve"> </w:t>
-      </w:r>
-      <w:r>
-        <w:t>siempre lo mismo. En nuestros datos no es así:</w:t>
+        <w:t xml:space="preserve"> siempre lo mismo. En nuestros datos no es así:</w:t>
       </w:r>
     </w:p>
     <w:tbl>
@@ -5566,10 +5576,10 @@
         <w:t>2</w:t>
       </w:r>
       <w:r>
-        <w:t xml:space="preserve"> predicho, y efecto = diferencia media dentro − difere</w:t>
-      </w:r>
-      <w:r>
-        <w:t>ncia media fuera. Se resta la de fuera porque el modelo no conoce la renovación de coches ni otros cambios de toda la comarca, que aparecen también fuera.</w:t>
+        <w:t xml:space="preserve"> </w:t>
+      </w:r>
+      <w:r>
+        <w:t>predicho, y efecto = diferencia media dentro − diferencia media fuera. Se resta la de fuera porque el modelo no conoce la renovación de coches ni otros cambios de toda la comarca, que aparecen también fuera.</w:t>
       </w:r>
     </w:p>
     <w:p>
@@ -5619,7 +5629,10 @@
         <w:t>0,49 µg/m³</w:t>
       </w:r>
       <w:r>
-        <w:t xml:space="preserve"> (de −0,86 a −0,12; −1,9 % del nivel de antes). </w:t>
+        <w:t xml:space="preserve"> </w:t>
+      </w:r>
+      <w:r>
+        <w:t xml:space="preserve">(de −0,86 a −0,12; −1,9 % del nivel de antes). </w:t>
       </w:r>
       <w:r>
         <w:rPr>
@@ -5629,19 +5642,29 @@
         <w:t>Qué significa:</w:t>
       </w:r>
       <w:r>
+        <w:t xml:space="preserve"> descontado el tiempo atmosférico y lo que pasó fuera, el NO</w:t>
+      </w:r>
+      <w:r>
+        <w:rPr>
+          <w:vertAlign w:val="subscript"/>
+        </w:rPr>
+        <w:t>2</w:t>
+      </w:r>
+      <w:r>
+        <w:t xml:space="preserve"> bajó dentro algo más que fuera. El efecto es pequeño: menor que el que da la comparación de medias del informe de análisis (DiD, −1,63). </w:t>
+      </w:r>
+      <w:r>
+        <w:rPr>
+          <w:b/>
+          <w:bCs/>
+        </w:rPr>
+        <w:t>Por qué el modelo da menos:</w:t>
+      </w:r>
+      <w:r>
         <w:t xml:space="preserve"> </w:t>
       </w:r>
       <w:r>
-        <w:t>descontado el tiempo atmosférico y lo que pasó fuera, el NO</w:t>
-      </w:r>
-      <w:r>
-        <w:rPr>
-          <w:vertAlign w:val="subscript"/>
-        </w:rPr>
-        <w:t>2</w:t>
-      </w:r>
-      <w:r>
-        <w:t xml:space="preserve"> bajó dentro algo más que fuera. El efecto es pequeño: menor que el que da la comparación de medias del informe de análisis (−1,63). Se puede medir aunque el error por hora sea de 8,14 porque es la media de 134.753 horas-estación, y los errores hacia arriba y hacia abajo se compensan.</w:t>
+        <w:t>DiD resta medias y no descuenta el tiempo atmosférico; el modelo predice cada hora con el tiempo que hizo de verdad y sí lo descuenta. La parte de la bajada que DiD atribuye a la ZBE y el modelo no es la que el modelo explica con el tiempo atmosférico. Se puede medir aunque el error por hora sea de 8,14 porque es la media de 134.753 horas-estación, y los errores hacia arriba y hacia abajo se compensan.</w:t>
       </w:r>
     </w:p>
     <w:p>
@@ -6064,9 +6087,9 @@
         <w:tblLook w:val="04A0" w:firstRow="1" w:lastRow="0" w:firstColumn="1" w:lastColumn="0" w:noHBand="0" w:noVBand="1"/>
       </w:tblPr>
       <w:tblGrid>
-        <w:gridCol w:w="2200"/>
-        <w:gridCol w:w="2736"/>
-        <w:gridCol w:w="4687"/>
+        <w:gridCol w:w="1888"/>
+        <w:gridCol w:w="4119"/>
+        <w:gridCol w:w="3616"/>
       </w:tblGrid>
       <w:tr>
         <w:tc>
@@ -6262,43 +6285,43 @@
                 <w:sz w:val="22"/>
                 <w:szCs w:val="22"/>
               </w:rPr>
-              <w:t>Cronometrar una actualización completa a mano y con el notebook.</w:t>
-            </w:r>
-          </w:p>
-        </w:tc>
-        <w:tc>
-          <w:tcPr>
-            <w:tcW w:w="0" w:type="auto"/>
-            <w:tcBorders>
-              <w:top w:val="single" w:sz="6" w:space="0" w:color="999999"/>
-              <w:left w:val="single" w:sz="6" w:space="0" w:color="999999"/>
-              <w:bottom w:val="single" w:sz="6" w:space="0" w:color="999999"/>
-              <w:right w:val="single" w:sz="6" w:space="0" w:color="999999"/>
-            </w:tcBorders>
-            <w:tcMar>
-              <w:top w:w="0" w:type="dxa"/>
-              <w:left w:w="60" w:type="dxa"/>
-              <w:bottom w:w="0" w:type="dxa"/>
-              <w:right w:w="60" w:type="dxa"/>
-            </w:tcMar>
-            <w:hideMark/>
-          </w:tcPr>
-          <w:p>
-            <w:pPr>
-              <w:spacing w:before="40" w:after="80"/>
-              <w:rPr>
-                <w:rFonts w:ascii="Arial" w:eastAsia="Times New Roman" w:hAnsi="Arial" w:cs="Arial"/>
-                <w:sz w:val="22"/>
-                <w:szCs w:val="22"/>
-              </w:rPr>
-            </w:pPr>
-            <w:r>
-              <w:rPr>
-                <w:rFonts w:ascii="Arial" w:eastAsia="Times New Roman" w:hAnsi="Arial" w:cs="Arial"/>
-                <w:sz w:val="22"/>
-                <w:szCs w:val="22"/>
-              </w:rPr>
-              <w:t>Antes: [A COMPLETAR POR EL EQUIPO]. Ahora: un comando; tiempo [A COMPLETAR POR EL EQUIPO].</w:t>
+              <w:t>Horas de una persona para actualizar el análisis con datos nuevos: a mano (descargar, limpiar y calcular) frente a con el notebook (un comando). Se cronometran las dos formas.</w:t>
+            </w:r>
+          </w:p>
+        </w:tc>
+        <w:tc>
+          <w:tcPr>
+            <w:tcW w:w="0" w:type="auto"/>
+            <w:tcBorders>
+              <w:top w:val="single" w:sz="6" w:space="0" w:color="999999"/>
+              <w:left w:val="single" w:sz="6" w:space="0" w:color="999999"/>
+              <w:bottom w:val="single" w:sz="6" w:space="0" w:color="999999"/>
+              <w:right w:val="single" w:sz="6" w:space="0" w:color="999999"/>
+            </w:tcBorders>
+            <w:tcMar>
+              <w:top w:w="0" w:type="dxa"/>
+              <w:left w:w="60" w:type="dxa"/>
+              <w:bottom w:w="0" w:type="dxa"/>
+              <w:right w:w="60" w:type="dxa"/>
+            </w:tcMar>
+            <w:hideMark/>
+          </w:tcPr>
+          <w:p>
+            <w:pPr>
+              <w:spacing w:before="40" w:after="80"/>
+              <w:rPr>
+                <w:rFonts w:ascii="Arial" w:eastAsia="Times New Roman" w:hAnsi="Arial" w:cs="Arial"/>
+                <w:sz w:val="22"/>
+                <w:szCs w:val="22"/>
+              </w:rPr>
+            </w:pPr>
+            <w:r>
+              <w:rPr>
+                <w:rFonts w:ascii="Arial" w:eastAsia="Times New Roman" w:hAnsi="Arial" w:cs="Arial"/>
+                <w:sz w:val="22"/>
+                <w:szCs w:val="22"/>
+              </w:rPr>
+              <w:t>A medir en la puesta en marcha.</w:t>
             </w:r>
           </w:p>
         </w:tc>
@@ -6336,7 +6359,6 @@
                 <w:sz w:val="22"/>
                 <w:szCs w:val="22"/>
               </w:rPr>
-              <w:lastRenderedPageBreak/>
               <w:t>Tiempo hasta tener el panel actualizado</w:t>
             </w:r>
           </w:p>
@@ -6809,7 +6831,10 @@
         <w:pStyle w:val="vineta"/>
       </w:pPr>
       <w:r>
-        <w:t>•  Descuenta lo que pasa en toda la comarca: el modelo también se pasa fuera (−1,73), y eso se resta.</w:t>
+        <w:t>•  </w:t>
+      </w:r>
+      <w:r>
+        <w:t>Descuenta lo que pasa en toda la comarca: el modelo también se pasa fuera (−1,73), y eso se resta.</w:t>
       </w:r>
     </w:p>
     <w:p>
@@ -6817,10 +6842,7 @@
         <w:pStyle w:val="vineta"/>
       </w:pPr>
       <w:r>
-        <w:t>•  </w:t>
-      </w:r>
-      <w:r>
-        <w:t>Se puede comprobar: validación temporal y placebo con su resultado.</w:t>
+        <w:t>•  Se puede comprobar: validación temporal y placebo con su resultado.</w:t>
       </w:r>
     </w:p>
     <w:p>
@@ -6872,7 +6894,10 @@
         <w:pStyle w:val="vineta"/>
       </w:pPr>
       <w:r>
-        <w:t>•  El tamaño del efecto depende del método (ver riesgos).</w:t>
+        <w:t>•  </w:t>
+      </w:r>
+      <w:r>
+        <w:t>El tamaño del efecto depende del método (ver riesgos).</w:t>
       </w:r>
     </w:p>
     <w:p>
@@ -6899,9 +6924,9 @@
         <w:tblLook w:val="04A0" w:firstRow="1" w:lastRow="0" w:firstColumn="1" w:lastColumn="0" w:noHBand="0" w:noVBand="1"/>
       </w:tblPr>
       <w:tblGrid>
-        <w:gridCol w:w="1920"/>
-        <w:gridCol w:w="3542"/>
-        <w:gridCol w:w="4161"/>
+        <w:gridCol w:w="1799"/>
+        <w:gridCol w:w="3182"/>
+        <w:gridCol w:w="4642"/>
       </w:tblGrid>
       <w:tr>
         <w:tc>
@@ -7590,7 +7615,7 @@
                 <w:sz w:val="22"/>
                 <w:szCs w:val="22"/>
               </w:rPr>
-              <w:t>Modelo −0,49; DiD −1,63 (de −2,38 a −0,94). Los dos bajan, pero sus intervalos no se solapan: el tamaño exacto es incierto.</w:t>
+              <w:t>Modelo −0,49; DiD −1,63 (de −2,38 a −0,94). Los dos bajan, pero sus intervalos no se solapan: el tamaño exacto es incierto. La diferencia viene de que el modelo descuenta el tiempo atmosférico y DiD no.</w:t>
             </w:r>
           </w:p>
         </w:tc>
@@ -7605,11 +7630,13 @@
           <w:b/>
           <w:bCs/>
         </w:rPr>
-        <w:lastRenderedPageBreak/>
         <w:t>Por qué DiD no es el modelo principal.</w:t>
       </w:r>
       <w:r>
-        <w:t xml:space="preserve"> DiD solo resta medias: no descuenta el tiempo hora a hora. Si después de la ZBE hubiera hecho más viento en el centro que fuera, lo contaría como efecto de la ZBE. Se mantiene como comprobación porque es simple y no depende de ningún modelo: si los dos métodos dan una bajada, la dirección del resultado no depende del método elegido.</w:t>
+        <w:t xml:space="preserve"> </w:t>
+      </w:r>
+      <w:r>
+        <w:t>DiD solo resta medias: no descuenta el tiempo hora a hora. Si después de la ZBE hubiera hecho más viento en el centro que fuera, lo contaría como efecto de la ZBE. Se mantiene como comprobación porque es simple y no depende de ningún modelo: si los dos métodos dan una bajada, la dirección del resultado no depende del método elegido.</w:t>
       </w:r>
     </w:p>
     <w:p>
@@ -7657,7 +7684,10 @@
         <w:t>No ampliar todavía:</w:t>
       </w:r>
       <w:r>
-        <w:t xml:space="preserve"> el efecto es pequeño y la fase 2 no añade una bajada distinguible de cero (−0,52; de −1,72 a +0,74).</w:t>
+        <w:t xml:space="preserve"> </w:t>
+      </w:r>
+      <w:r>
+        <w:t>el efecto es pequeño y la fase 2 no añade una bajada distinguible de cero (−0,52; de −1,72 a +0,74).</w:t>
       </w:r>
     </w:p>
     <w:p>
@@ -7697,10 +7727,7 @@
         <w:pStyle w:val="vineta"/>
       </w:pPr>
       <w:r>
-        <w:t>•  </w:t>
-      </w:r>
-      <w:r>
-        <w:t xml:space="preserve">[1] Grange, S. K. y Carslaw, D. C. (2019). Using meteorological normalisation to detect interventions in air quality time series. </w:t>
+        <w:t xml:space="preserve">•  [1] Grange, S. K. y Carslaw, D. C. (2019). Using meteorological normalisation to detect interventions in air quality time series. </w:t>
       </w:r>
       <w:r>
         <w:rPr>
@@ -7718,7 +7745,10 @@
         <w:pStyle w:val="vineta"/>
       </w:pPr>
       <w:r>
-        <w:t xml:space="preserve">•  [2] Tong, C., Dai, Y., Cole, M., Elliott, R. J. R., Bartington, S. E., Liu, B. y Shi, Z. (2025). Further improvement in London's air quality demands more than the Ultra Low Emission Zone policy. </w:t>
+        <w:t>•  </w:t>
+      </w:r>
+      <w:r>
+        <w:t xml:space="preserve">[2] Tong, C., Dai, Y., Cole, M., Elliott, R. J. R., Bartington, S. E., Liu, B. y Shi, Z. (2025). Further improvement in London's air quality demands more than the Ultra Low Emission Zone policy. </w:t>
       </w:r>
       <w:r>
         <w:rPr>
@@ -7736,10 +7766,7 @@
         <w:pStyle w:val="vineta"/>
       </w:pPr>
       <w:r>
-        <w:t>•  </w:t>
-      </w:r>
-      <w:r>
-        <w:t xml:space="preserve">[3] Toutouh, J., Lebrusán, I. y Nesmachnow, S. (2020). Computational Intelligence for Evaluating the Air Quality in the Center of Madrid, Spain. En </w:t>
+        <w:t xml:space="preserve">•  [3] Toutouh, J., Lebrusán, I. y Nesmachnow, S. (2020). Computational Intelligence for Evaluating the Air Quality in the Center of Madrid, Spain. En </w:t>
       </w:r>
       <w:r>
         <w:rPr>
@@ -7757,7 +7784,10 @@
         <w:pStyle w:val="vineta"/>
       </w:pPr>
       <w:r>
-        <w:t xml:space="preserve">•  [4] Bertrand, J.-M., Meleux, F., Ung, A., Descombes, G. y Colette, A. (2023). Technical note: Improving the European air quality forecast of the Copernicus Atmosphere Monitoring Service using machine learning techniques. </w:t>
+        <w:t>•</w:t>
+      </w:r>
+      <w:r>
+        <w:t xml:space="preserve">  [4] Bertrand, J.-M., Meleux, F., Ung, A., Descombes, G. y Colette, A. (2023). Technical note: Improving the European air quality forecast of the Copernicus Atmosphere Monitoring Service using machine learning techniques. </w:t>
       </w:r>
       <w:r>
         <w:rPr>
@@ -7775,7 +7805,7 @@
         <w:pStyle w:val="vineta"/>
       </w:pPr>
       <w:r>
-        <w:t>•  [5] Google Research. Project Green Light. [PENDIENTE DE VERIFICAR: página oficial y cifras de resultados].</w:t>
+        <w:t>•  [5] Ciudad de Boston. Project Green Light: Saving You Time On The Road. https://www.boston.gov/node/16372851</w:t>
       </w:r>
     </w:p>
     <w:p>
@@ -7783,7 +7813,10 @@
         <w:pStyle w:val="vineta"/>
       </w:pPr>
       <w:r>
-        <w:t>•  [6] Ayuntamiento de Madrid. Protocolo de actuación para episodios de contaminación por dióxido de nitrógeno. [PENDIENTE DE VERIFICAR: versión vigente y modelo de predicción que usa].</w:t>
+        <w:t>•  </w:t>
+      </w:r>
+      <w:r>
+        <w:t>[6] Ayuntamiento de Madrid (2015). Protocolo de medidas a adoptar durante episodios de alta contaminación por dióxido de nitrógeno en la ciudad de Madrid. https://www.madrid.es/UnidadWeb/UGNormativas/Normativa/2015/ficheros/AnexoProtocoloContaminacion.pdf</w:t>
       </w:r>
     </w:p>
     <w:p>
@@ -8529,7 +8562,7 @@
     <w:link w:val="EncabezadoCar"/>
     <w:uiPriority w:val="99"/>
     <w:unhideWhenUsed/>
-    <w:rsid w:val="00641D56"/>
+    <w:rsid w:val="00AA2DFE"/>
     <w:pPr>
       <w:tabs>
         <w:tab w:val="center" w:pos="4252"/>
@@ -8542,7 +8575,7 @@
     <w:basedOn w:val="Fuentedeprrafopredeter"/>
     <w:link w:val="Encabezado"/>
     <w:uiPriority w:val="99"/>
-    <w:rsid w:val="00641D56"/>
+    <w:rsid w:val="00AA2DFE"/>
     <w:rPr>
       <w:rFonts w:eastAsiaTheme="minorEastAsia"/>
       <w:sz w:val="24"/>
@@ -8555,7 +8588,7 @@
     <w:link w:val="PiedepginaCar"/>
     <w:uiPriority w:val="99"/>
     <w:unhideWhenUsed/>
-    <w:rsid w:val="00641D56"/>
+    <w:rsid w:val="00AA2DFE"/>
     <w:pPr>
       <w:tabs>
         <w:tab w:val="center" w:pos="4252"/>
@@ -8568,7 +8601,7 @@
     <w:basedOn w:val="Fuentedeprrafopredeter"/>
     <w:link w:val="Piedepgina"/>
     <w:uiPriority w:val="99"/>
-    <w:rsid w:val="00641D56"/>
+    <w:rsid w:val="00AA2DFE"/>
     <w:rPr>
       <w:rFonts w:eastAsiaTheme="minorEastAsia"/>
       <w:sz w:val="24"/>
@@ -8581,7 +8614,7 @@
     <w:uiPriority w:val="99"/>
     <w:semiHidden/>
     <w:unhideWhenUsed/>
-    <w:rsid w:val="00641D56"/>
+    <w:rsid w:val="00AA2DFE"/>
   </w:style>
 </w:styles>
 </file>

</xml_diff>

<commit_message>
Corregir el f-string sin evaluar del MIA y regenerar el .md, el .docx y el .pdf
</commit_message>
<xml_diff>
--- a/docs/MIA_Haizen_Lab.docx
+++ b/docs/MIA_Haizen_Lab.docx
@@ -2820,7 +2820,7 @@
         <w:t>2</w:t>
       </w:r>
       <w:r>
-        <w:t>. Solo el primer paso puede ser IA; el segundo y el tercero son reglas. En Bilbao no hubo ninguna hora por encima de 200 µg/m³ entre {min(horas_200)} y {max(horas_200)} (máximo horario: 168 µg/m³), así que este aviso no se habría activado nunca. Tiene menos relación con la decisión sobre la ZBE que la evaluación del efecto, que es lo que se propone.</w:t>
+        <w:t>. Solo el primer paso puede ser IA; el segundo y el tercero son reglas. En Bilbao no hubo ninguna hora por encima de 200 µg/m³ entre 2022 y 2026 (máximo horario: 168 µg/m³), así que este aviso no se habría activado nunca. Tiene menos relación con la decisión sobre la ZBE que la evaluación del efecto, que es lo que se propone.</w:t>
       </w:r>
     </w:p>
     <w:p>
@@ -8562,7 +8562,7 @@
     <w:link w:val="EncabezadoCar"/>
     <w:uiPriority w:val="99"/>
     <w:unhideWhenUsed/>
-    <w:rsid w:val="00E2164D"/>
+    <w:rsid w:val="00D00B15"/>
     <w:pPr>
       <w:tabs>
         <w:tab w:val="center" w:pos="4252"/>
@@ -8575,7 +8575,7 @@
     <w:basedOn w:val="Fuentedeprrafopredeter"/>
     <w:link w:val="Encabezado"/>
     <w:uiPriority w:val="99"/>
-    <w:rsid w:val="00E2164D"/>
+    <w:rsid w:val="00D00B15"/>
     <w:rPr>
       <w:rFonts w:eastAsiaTheme="minorEastAsia"/>
       <w:sz w:val="24"/>
@@ -8588,7 +8588,7 @@
     <w:link w:val="PiedepginaCar"/>
     <w:uiPriority w:val="99"/>
     <w:unhideWhenUsed/>
-    <w:rsid w:val="00E2164D"/>
+    <w:rsid w:val="00D00B15"/>
     <w:pPr>
       <w:tabs>
         <w:tab w:val="center" w:pos="4252"/>
@@ -8601,7 +8601,7 @@
     <w:basedOn w:val="Fuentedeprrafopredeter"/>
     <w:link w:val="Piedepgina"/>
     <w:uiPriority w:val="99"/>
-    <w:rsid w:val="00E2164D"/>
+    <w:rsid w:val="00D00B15"/>
     <w:rPr>
       <w:rFonts w:eastAsiaTheme="minorEastAsia"/>
       <w:sz w:val="24"/>
@@ -8614,7 +8614,7 @@
     <w:uiPriority w:val="99"/>
     <w:semiHidden/>
     <w:unhideWhenUsed/>
-    <w:rsid w:val="00E2164D"/>
+    <w:rsid w:val="00D00B15"/>
   </w:style>
 </w:styles>
 </file>

</xml_diff>